<commit_message>
Der wirkliche Wetterbericht fuer einen gewaehlten Ort auf dem Streifen
Ortsfeld und Knopf holen die neun Groessen aus dem Netz und drucken sie im Format
des Geraetes. wttr.in gibt einem Browser die Bildschirmfassung statt der Textzeile,
weil es nach der Browserkennung entscheidet; deshalb kommen dieselben Groessen von
einem Dienst, der aus dem Browser heraus antwortet. Windpfeil und Mondphase rechnet
die Seite selbst. Ohne Netz bleibt der gespeicherte Abruf stehen.

Co-Authored-By: Claude Opus 5 (1M context) <noreply@anthropic.com>
</commit_message>
<xml_diff>
--- a/MANUSKRIPT_Fernschreiber.docx
+++ b/MANUSKRIPT_Fernschreiber.docx
@@ -9121,7 +9121,7 @@
       </w:r>
     </w:p>
     <w:bookmarkEnd w:id="50"/>
-    <w:bookmarkStart w:id="51" w:name="die-seite-simulation-im-browser"/>
+    <w:bookmarkStart w:id="52" w:name="die-seite-simulation-im-browser"/>
     <w:p>
       <w:pPr>
         <w:pStyle w:val="Heading1"/>
@@ -9575,23 +9575,222 @@
         <w:t xml:space="preserve">Rahmen für Rahmen mit dem, was der Browser erzeugt — abweichen darf kein einziger.</w:t>
       </w:r>
     </w:p>
-    <w:bookmarkEnd w:id="51"/>
-    <w:bookmarkStart w:id="54" w:name="bedienung-und-betrieb"/>
-    <w:p>
-      <w:pPr>
-        <w:pStyle w:val="Heading1"/>
-      </w:pPr>
-      <w:r>
-        <w:t xml:space="preserve">11. Bedienung und Betrieb</w:t>
-      </w:r>
-    </w:p>
-    <w:bookmarkStart w:id="52" w:name="auf-dem-esp32"/>
+    <w:bookmarkStart w:id="51" w:name="X91bb6f63fd8691dc0d9d797e155720d4954cea3"/>
     <w:p>
       <w:pPr>
         <w:pStyle w:val="Heading2"/>
       </w:pPr>
       <w:r>
-        <w:t xml:space="preserve">Auf dem ESP32</w:t>
+        <w:t xml:space="preserve">10.6 Der wirkliche Wetterbericht für einen gewählten Ort</w:t>
+      </w:r>
+    </w:p>
+    <w:p>
+      <w:pPr>
+        <w:pStyle w:val="FirstParagraph"/>
+      </w:pPr>
+      <w:r>
+        <w:t xml:space="preserve">Die Seite kann mehr als den gespeicherten Abruf abspielen. Ein Feld nimmt einen Ortsnamen auf, ein</w:t>
+      </w:r>
+      <w:r>
+        <w:t xml:space="preserve"> </w:t>
+      </w:r>
+      <w:r>
+        <w:t xml:space="preserve">Knopf holt für diesen Ort den</w:t>
+      </w:r>
+      <w:r>
+        <w:t xml:space="preserve"> </w:t>
+      </w:r>
+      <w:r>
+        <w:rPr>
+          <w:b/>
+          <w:bCs/>
+        </w:rPr>
+        <w:t xml:space="preserve">wirklichen, aktuellen</w:t>
+      </w:r>
+      <w:r>
+        <w:t xml:space="preserve"> </w:t>
+      </w:r>
+      <w:r>
+        <w:t xml:space="preserve">Wetterbericht und druckt ihn auf den Streifen.</w:t>
+      </w:r>
+      <w:r>
+        <w:t xml:space="preserve"> </w:t>
+      </w:r>
+      <w:r>
+        <w:t xml:space="preserve">Damit steht dieselbe Kette wie am Gerät, nur mit dem Browser als Rechner: abfragen, zerlegen,</w:t>
+      </w:r>
+      <w:r>
+        <w:t xml:space="preserve"> </w:t>
+      </w:r>
+      <w:r>
+        <w:t xml:space="preserve">transliterieren, umbrechen, nach ITA2 setzen, Rahmen für Rahmen bei 50 Baud drucken.</w:t>
+      </w:r>
+    </w:p>
+    <w:p>
+      <w:pPr>
+        <w:pStyle w:val="BodyText"/>
+      </w:pPr>
+      <w:r>
+        <w:t xml:space="preserve">Eine Eigenheit des Dienstes zwingt dabei zu einem Umweg, der hier festgehalten sei, weil er nicht</w:t>
+      </w:r>
+      <w:r>
+        <w:t xml:space="preserve"> </w:t>
+      </w:r>
+      <w:r>
+        <w:t xml:space="preserve">offensichtlich ist. Das Gerät fragt</w:t>
+      </w:r>
+      <w:r>
+        <w:t xml:space="preserve"> </w:t>
+      </w:r>
+      <w:r>
+        <w:rPr>
+          <w:rStyle w:val="VerbatimChar"/>
+        </w:rPr>
+        <w:t xml:space="preserve">wttr.in</w:t>
+      </w:r>
+      <w:r>
+        <w:t xml:space="preserve"> </w:t>
+      </w:r>
+      <w:r>
+        <w:t xml:space="preserve">und bekommt auf die Formatzeile hin genau eine Textzeile</w:t>
+      </w:r>
+      <w:r>
+        <w:t xml:space="preserve"> </w:t>
+      </w:r>
+      <w:r>
+        <w:t xml:space="preserve">mit neun durch</w:t>
+      </w:r>
+      <w:r>
+        <w:t xml:space="preserve"> </w:t>
+      </w:r>
+      <w:r>
+        <w:rPr>
+          <w:rStyle w:val="VerbatimChar"/>
+        </w:rPr>
+        <w:t xml:space="preserve">|</w:t>
+      </w:r>
+      <w:r>
+        <w:t xml:space="preserve"> </w:t>
+      </w:r>
+      <w:r>
+        <w:t xml:space="preserve">getrennten Feldern zurück. Ein Browser bekommt dieselbe Anfrage als</w:t>
+      </w:r>
+      <w:r>
+        <w:t xml:space="preserve"> </w:t>
+      </w:r>
+      <w:r>
+        <w:rPr>
+          <w:b/>
+          <w:bCs/>
+        </w:rPr>
+        <w:t xml:space="preserve">Bildschirmseite</w:t>
+      </w:r>
+      <w:r>
+        <w:t xml:space="preserve"> </w:t>
+      </w:r>
+      <w:r>
+        <w:t xml:space="preserve">beantwortet:</w:t>
+      </w:r>
+      <w:r>
+        <w:t xml:space="preserve"> </w:t>
+      </w:r>
+      <w:r>
+        <w:rPr>
+          <w:rStyle w:val="VerbatimChar"/>
+        </w:rPr>
+        <w:t xml:space="preserve">wttr.in</w:t>
+      </w:r>
+      <w:r>
+        <w:t xml:space="preserve"> </w:t>
+      </w:r>
+      <w:r>
+        <w:t xml:space="preserve">entscheidet nach der Browserkennung im Kopf der Anfrage, und diese Kennung darf</w:t>
+      </w:r>
+      <w:r>
+        <w:t xml:space="preserve"> </w:t>
+      </w:r>
+      <w:r>
+        <w:t xml:space="preserve">eine Seite nicht selbst setzen — der Browser verbietet es. Die Zeile ist aus einer Seite heraus also</w:t>
+      </w:r>
+      <w:r>
+        <w:t xml:space="preserve"> </w:t>
+      </w:r>
+      <w:r>
+        <w:t xml:space="preserve">nicht zu bekommen.</w:t>
+      </w:r>
+    </w:p>
+    <w:p>
+      <w:pPr>
+        <w:pStyle w:val="BodyText"/>
+      </w:pPr>
+      <w:r>
+        <w:t xml:space="preserve">Die Seite holt deshalb dieselben neun Größen bei einem Dienst, der aus dem Browser heraus antwortet</w:t>
+      </w:r>
+      <w:r>
+        <w:t xml:space="preserve"> </w:t>
+      </w:r>
+      <w:r>
+        <w:t xml:space="preserve">(Ortssuche und Wetterabruf, beide ohne Schlüssel und beide mit</w:t>
+      </w:r>
+      <w:r>
+        <w:t xml:space="preserve"> </w:t>
+      </w:r>
+      <w:r>
+        <w:rPr>
+          <w:rStyle w:val="VerbatimChar"/>
+        </w:rPr>
+        <w:t xml:space="preserve">Access-Control-Allow-Origin: *</w:t>
+      </w:r>
+      <w:r>
+        <w:t xml:space="preserve">), und</w:t>
+      </w:r>
+      <w:r>
+        <w:t xml:space="preserve"> </w:t>
+      </w:r>
+      <w:r>
+        <w:t xml:space="preserve">setzt sie in</w:t>
+      </w:r>
+      <w:r>
+        <w:t xml:space="preserve"> </w:t>
+      </w:r>
+      <w:r>
+        <w:rPr>
+          <w:b/>
+          <w:bCs/>
+        </w:rPr>
+        <w:t xml:space="preserve">genau das Format</w:t>
+      </w:r>
+      <w:r>
+        <w:t xml:space="preserve">, das das Gerät von</w:t>
+      </w:r>
+      <w:r>
+        <w:t xml:space="preserve"> </w:t>
+      </w:r>
+      <w:r>
+        <w:rPr>
+          <w:rStyle w:val="VerbatimChar"/>
+        </w:rPr>
+        <w:t xml:space="preserve">wttr.in</w:t>
+      </w:r>
+      <w:r>
+        <w:t xml:space="preserve"> </w:t>
+      </w:r>
+      <w:r>
+        <w:t xml:space="preserve">erhält. Ab dieser Zeile läuft alles durch</w:t>
+      </w:r>
+      <w:r>
+        <w:t xml:space="preserve"> </w:t>
+      </w:r>
+      <w:r>
+        <w:t xml:space="preserve">denselben Code wie in der Firmware; die Umsetzung ist also nach wie vor die des Geräts.</w:t>
+      </w:r>
+    </w:p>
+    <w:p>
+      <w:pPr>
+        <w:pStyle w:val="BodyText"/>
+      </w:pPr>
+      <w:r>
+        <w:t xml:space="preserve">Zwei der neun Felder rechnet die Seite dabei selbst aus:</w:t>
       </w:r>
     </w:p>
     <w:p>
@@ -9603,91 +9802,96 @@
         </w:numPr>
       </w:pPr>
       <w:r>
-        <w:t xml:space="preserve">Netzname und Kennwort in die beiden Zeilen am Kopf von</w:t>
-      </w:r>
-      <w:r>
-        <w:t xml:space="preserve"> </w:t>
-      </w:r>
-      <w:r>
-        <w:rPr>
-          <w:rStyle w:val="VerbatimChar"/>
-        </w:rPr>
-        <w:t xml:space="preserve">RTTY_Wetter_20.py</w:t>
-      </w:r>
-      <w:r>
-        <w:t xml:space="preserve"> </w:t>
-      </w:r>
-      <w:r>
-        <w:t xml:space="preserve">eintragen. In der</w:t>
-      </w:r>
-      <w:r>
-        <w:t xml:space="preserve"> </w:t>
-      </w:r>
-      <w:r>
-        <w:t xml:space="preserve">veröffentlichten Fassung heißen sie</w:t>
-      </w:r>
-      <w:r>
-        <w:t xml:space="preserve"> </w:t>
-      </w:r>
-      <w:r>
-        <w:rPr>
-          <w:rStyle w:val="VerbatimChar"/>
-        </w:rPr>
-        <w:t xml:space="preserve">WLAN_NAME</w:t>
-      </w:r>
-      <w:r>
-        <w:t xml:space="preserve"> </w:t>
-      </w:r>
-      <w:r>
-        <w:t xml:space="preserve">und</w:t>
-      </w:r>
-      <w:r>
-        <w:t xml:space="preserve"> </w:t>
-      </w:r>
-      <w:r>
-        <w:rPr>
-          <w:rStyle w:val="VerbatimChar"/>
-        </w:rPr>
-        <w:t xml:space="preserve">WLAN_WORT</w:t>
-      </w:r>
-      <w:r>
-        <w:t xml:space="preserve"> </w:t>
-      </w:r>
-      <w:r>
-        <w:t xml:space="preserve">und tragen Platzhalter; das</w:t>
-      </w:r>
-      <w:r>
-        <w:t xml:space="preserve"> </w:t>
-      </w:r>
-      <w:r>
-        <w:t xml:space="preserve">Kennwort ist dort durch genauso viele</w:t>
-      </w:r>
-      <w:r>
-        <w:t xml:space="preserve"> </w:t>
-      </w:r>
-      <w:r>
-        <w:rPr>
-          <w:rStyle w:val="VerbatimChar"/>
-        </w:rPr>
-        <w:t xml:space="preserve">x</w:t>
-      </w:r>
-      <w:r>
-        <w:t xml:space="preserve"> </w:t>
-      </w:r>
-      <w:r>
-        <w:t xml:space="preserve">ersetzt, wie es Zeichen hat. (Im Arbeitsexemplar heißen</w:t>
-      </w:r>
-      <w:r>
-        <w:t xml:space="preserve"> </w:t>
-      </w:r>
-      <w:r>
-        <w:t xml:space="preserve">die beiden Namen anders; die Ausfuhr benennt sie um, damit kein Prüfmuster für Zugangsdaten</w:t>
-      </w:r>
-      <w:r>
-        <w:t xml:space="preserve"> </w:t>
-      </w:r>
-      <w:r>
-        <w:t xml:space="preserve">anschlägt.)</w:t>
+        <w:rPr>
+          <w:b/>
+          <w:bCs/>
+        </w:rPr>
+        <w:t xml:space="preserve">Der Windpfeil.</w:t>
+      </w:r>
+      <w:r>
+        <w:t xml:space="preserve"> </w:t>
+      </w:r>
+      <w:r>
+        <w:t xml:space="preserve">Der Dienst liefert die Richtung als Winkel. Die Seite rundet ihn auf ein Achtel</w:t>
+      </w:r>
+      <w:r>
+        <w:t xml:space="preserve"> </w:t>
+      </w:r>
+      <w:r>
+        <w:t xml:space="preserve">des Vollkreises und setzt den zugehörigen Pfeil, den</w:t>
+      </w:r>
+      <w:r>
+        <w:t xml:space="preserve"> </w:t>
+      </w:r>
+      <w:r>
+        <w:rPr>
+          <w:rStyle w:val="VerbatimChar"/>
+        </w:rPr>
+        <w:t xml:space="preserve">sanitize_weather_text()</w:t>
+      </w:r>
+      <w:r>
+        <w:t xml:space="preserve"> </w:t>
+      </w:r>
+      <w:r>
+        <w:t xml:space="preserve">der Firmware dann wie</w:t>
+      </w:r>
+      <w:r>
+        <w:t xml:space="preserve"> </w:t>
+      </w:r>
+      <w:r>
+        <w:t xml:space="preserve">gewohnt in</w:t>
+      </w:r>
+      <w:r>
+        <w:t xml:space="preserve"> </w:t>
+      </w:r>
+      <w:r>
+        <w:rPr>
+          <w:rStyle w:val="VerbatimChar"/>
+        </w:rPr>
+        <w:t xml:space="preserve">N</w:t>
+      </w:r>
+      <w:r>
+        <w:t xml:space="preserve">,</w:t>
+      </w:r>
+      <w:r>
+        <w:t xml:space="preserve"> </w:t>
+      </w:r>
+      <w:r>
+        <w:rPr>
+          <w:rStyle w:val="VerbatimChar"/>
+        </w:rPr>
+        <w:t xml:space="preserve">NO</w:t>
+      </w:r>
+      <w:r>
+        <w:t xml:space="preserve">,</w:t>
+      </w:r>
+      <w:r>
+        <w:t xml:space="preserve"> </w:t>
+      </w:r>
+      <w:r>
+        <w:rPr>
+          <w:rStyle w:val="VerbatimChar"/>
+        </w:rPr>
+        <w:t xml:space="preserve">O</w:t>
+      </w:r>
+      <w:r>
+        <w:t xml:space="preserve">, … übersetzt. Der Pfeil zeigt die Richtung,</w:t>
+      </w:r>
+      <w:r>
+        <w:t xml:space="preserve"> </w:t>
+      </w:r>
+      <w:r>
+        <w:rPr>
+          <w:b/>
+          <w:bCs/>
+        </w:rPr>
+        <w:t xml:space="preserve">aus der</w:t>
+      </w:r>
+      <w:r>
+        <w:t xml:space="preserve"> </w:t>
+      </w:r>
+      <w:r>
+        <w:t xml:space="preserve">es weht.</w:t>
       </w:r>
     </w:p>
     <w:p>
@@ -9699,152 +9903,114 @@
         </w:numPr>
       </w:pPr>
       <w:r>
-        <w:t xml:space="preserve">Die Datei als</w:t>
-      </w:r>
-      <w:r>
-        <w:t xml:space="preserve"> </w:t>
-      </w:r>
-      <w:r>
-        <w:rPr>
-          <w:rStyle w:val="VerbatimChar"/>
-        </w:rPr>
-        <w:t xml:space="preserve">main.py</w:t>
-      </w:r>
-      <w:r>
-        <w:t xml:space="preserve"> </w:t>
-      </w:r>
-      <w:r>
-        <w:t xml:space="preserve">auf den ESP32 bringen, zusammen mit</w:t>
-      </w:r>
-      <w:r>
-        <w:t xml:space="preserve"> </w:t>
-      </w:r>
-      <w:r>
-        <w:rPr>
-          <w:rStyle w:val="VerbatimChar"/>
-        </w:rPr>
-        <w:t xml:space="preserve">ssd1306.py</w:t>
-      </w:r>
-      <w:r>
-        <w:t xml:space="preserve">.</w:t>
-      </w:r>
-    </w:p>
-    <w:p>
-      <w:pPr>
-        <w:pStyle w:val="Compact"/>
-        <w:numPr>
-          <w:ilvl w:val="0"/>
-          <w:numId w:val="1013"/>
-        </w:numPr>
-      </w:pPr>
-      <w:r>
-        <w:t xml:space="preserve">Nach dem Start zeigt das OLED den WLAN-Zustand und die Adresse, dann läuft die Station: erster</w:t>
-      </w:r>
-      <w:r>
-        <w:t xml:space="preserve"> </w:t>
-      </w:r>
-      <w:r>
-        <w:t xml:space="preserve">gültiger Datensatz → Komplettdruck; danach Druck bei Änderung; alle sechs Stunden ein</w:t>
-      </w:r>
-      <w:r>
-        <w:t xml:space="preserve"> </w:t>
-      </w:r>
-      <w:r>
-        <w:t xml:space="preserve">Komplettdruck.</w:t>
-      </w:r>
-    </w:p>
-    <w:p>
-      <w:pPr>
-        <w:pStyle w:val="FirstParagraph"/>
-      </w:pPr>
-      <w:r>
         <w:rPr>
           <w:b/>
           <w:bCs/>
         </w:rPr>
-        <w:t xml:space="preserve">Stellschrauben:</w:t>
-      </w:r>
-      <w:r>
-        <w:t xml:space="preserve"> </w:t>
-      </w:r>
-      <w:r>
-        <w:rPr>
-          <w:rStyle w:val="VerbatimChar"/>
-        </w:rPr>
-        <w:t xml:space="preserve">ABFRAGE_INTERVALL</w:t>
-      </w:r>
-      <w:r>
-        <w:t xml:space="preserve"> </w:t>
-      </w:r>
-      <w:r>
-        <w:t xml:space="preserve">(Abfragetakt),</w:t>
-      </w:r>
-      <w:r>
-        <w:t xml:space="preserve"> </w:t>
-      </w:r>
-      <w:r>
-        <w:rPr>
-          <w:rStyle w:val="VerbatimChar"/>
-        </w:rPr>
-        <w:t xml:space="preserve">IMMER_DRUCKEN</w:t>
-      </w:r>
-      <w:r>
-        <w:t xml:space="preserve"> </w:t>
-      </w:r>
-      <w:r>
-        <w:t xml:space="preserve">(immer oder nur bei</w:t>
-      </w:r>
-      <w:r>
-        <w:t xml:space="preserve"> </w:t>
-      </w:r>
-      <w:r>
-        <w:t xml:space="preserve">Änderung),</w:t>
-      </w:r>
-      <w:r>
-        <w:t xml:space="preserve"> </w:t>
-      </w:r>
-      <w:r>
-        <w:rPr>
-          <w:rStyle w:val="VerbatimChar"/>
-        </w:rPr>
-        <w:t xml:space="preserve">KOMPLETT_INTERVALL</w:t>
-      </w:r>
-      <w:r>
-        <w:t xml:space="preserve"> </w:t>
-      </w:r>
-      <w:r>
-        <w:t xml:space="preserve">(Rhythmus des Komplettdrucks),</w:t>
-      </w:r>
-      <w:r>
-        <w:t xml:space="preserve"> </w:t>
-      </w:r>
-      <w:r>
-        <w:rPr>
-          <w:rStyle w:val="VerbatimChar"/>
-        </w:rPr>
-        <w:t xml:space="preserve">T68D_LINE_LENGTH</w:t>
-      </w:r>
-      <w:r>
-        <w:t xml:space="preserve"> </w:t>
-      </w:r>
-      <w:r>
-        <w:t xml:space="preserve">(Streifenbreite in</w:t>
-      </w:r>
-      <w:r>
-        <w:t xml:space="preserve"> </w:t>
-      </w:r>
-      <w:r>
-        <w:t xml:space="preserve">Zeichen).</w:t>
-      </w:r>
-    </w:p>
+        <w:t xml:space="preserve">Die Mondphase.</w:t>
+      </w:r>
+      <w:r>
+        <w:t xml:space="preserve"> </w:t>
+      </w:r>
+      <w:r>
+        <w:t xml:space="preserve">Sie steht in keinem der Wetterfelder. Die Seite rechnet das Alter des Mondes aus</w:t>
+      </w:r>
+      <w:r>
+        <w:t xml:space="preserve"> </w:t>
+      </w:r>
+      <w:r>
+        <w:t xml:space="preserve">der Zeit seit einem bekannten Neumond (6. Januar 2000, 18:14 UTC) modulo dem synodischen Monat von</w:t>
+      </w:r>
+      <w:r>
+        <w:t xml:space="preserve"> </w:t>
+      </w:r>
+      <w:r>
+        <w:t xml:space="preserve">29,530 588 853 Tagen und teilt es in acht Abschnitte — dieselben acht Zeichen, die das Gerät kennt.</w:t>
+      </w:r>
+      <w:r>
+        <w:t xml:space="preserve"> </w:t>
+      </w:r>
+      <w:r>
+        <w:t xml:space="preserve">Die Rechnung ist eine Näherung: sie unterstellt gleichförmigen Umlauf und geht deshalb um bis zu</w:t>
+      </w:r>
+      <w:r>
+        <w:t xml:space="preserve"> </w:t>
+      </w:r>
+      <w:r>
+        <w:t xml:space="preserve">etwa einen halben Tag fehl, was für die Angabe „zunehmend“ oder „abnehmend“ reicht.</w:t>
+      </w:r>
+    </w:p>
+    <w:p>
+      <w:pPr>
+        <w:pStyle w:val="FirstParagraph"/>
+      </w:pPr>
+      <w:r>
+        <w:t xml:space="preserve">Datum und Uhrzeit auf dem Kopf des Ausdrucks sind die</w:t>
+      </w:r>
+      <w:r>
+        <w:t xml:space="preserve"> </w:t>
+      </w:r>
+      <w:r>
+        <w:rPr>
+          <w:b/>
+          <w:bCs/>
+        </w:rPr>
+        <w:t xml:space="preserve">Ortszeit des gewählten Ortes</w:t>
+      </w:r>
+      <w:r>
+        <w:t xml:space="preserve">, wie der Dienst</w:t>
+      </w:r>
+      <w:r>
+        <w:t xml:space="preserve"> </w:t>
+      </w:r>
+      <w:r>
+        <w:t xml:space="preserve">sie mitliefert. Das Gerät nimmt statt dessen den Zeitstempel aus dem Kopf der Antwort und rechnet ihn</w:t>
+      </w:r>
+      <w:r>
+        <w:t xml:space="preserve"> </w:t>
+      </w:r>
+      <w:r>
+        <w:t xml:space="preserve">mit der eigenen Sommerzeitregel auf deutsche Zeit um (Abschnitt 6). Für einen Ort in einer anderen</w:t>
+      </w:r>
+      <w:r>
+        <w:t xml:space="preserve"> </w:t>
+      </w:r>
+      <w:r>
+        <w:t xml:space="preserve">Zeitzone ist die Ortszeit die sinnvollere Angabe; der Unterschied ist damit benannt.</w:t>
+      </w:r>
+    </w:p>
+    <w:p>
+      <w:pPr>
+        <w:pStyle w:val="BodyText"/>
+      </w:pPr>
+      <w:r>
+        <w:t xml:space="preserve">Ohne Netz bleibt es beim gespeicherten Abruf. Die Seite sagt das dann auch und arbeitet unverändert</w:t>
+      </w:r>
+      <w:r>
+        <w:t xml:space="preserve"> </w:t>
+      </w:r>
+      <w:r>
+        <w:t xml:space="preserve">weiter — sie ist und bleibt eine Datei, die für sich allein läuft.</w:t>
+      </w:r>
+    </w:p>
+    <w:bookmarkEnd w:id="51"/>
     <w:bookmarkEnd w:id="52"/>
-    <w:bookmarkStart w:id="53" w:name="auf-dem-pc"/>
+    <w:bookmarkStart w:id="55" w:name="bedienung-und-betrieb"/>
+    <w:p>
+      <w:pPr>
+        <w:pStyle w:val="Heading1"/>
+      </w:pPr>
+      <w:r>
+        <w:t xml:space="preserve">11. Bedienung und Betrieb</w:t>
+      </w:r>
+    </w:p>
+    <w:bookmarkStart w:id="53" w:name="auf-dem-esp32"/>
     <w:p>
       <w:pPr>
         <w:pStyle w:val="Heading2"/>
       </w:pPr>
       <w:r>
-        <w:t xml:space="preserve">Auf dem PC</w:t>
+        <w:t xml:space="preserve">Auf dem ESP32</w:t>
       </w:r>
     </w:p>
     <w:p>
@@ -9856,32 +10022,91 @@
         </w:numPr>
       </w:pPr>
       <w:r>
-        <w:t xml:space="preserve">Emulator mit Grafik:</w:t>
-      </w:r>
-      <w:r>
-        <w:t xml:space="preserve"> </w:t>
-      </w:r>
-      <w:r>
-        <w:rPr>
-          <w:rStyle w:val="VerbatimChar"/>
-        </w:rPr>
-        <w:t xml:space="preserve">python3 fernschreiber_emulator.py</w:t>
-      </w:r>
-      <w:r>
-        <w:t xml:space="preserve">, dann</w:t>
-      </w:r>
-      <w:r>
-        <w:t xml:space="preserve"> </w:t>
-      </w:r>
-      <w:r>
-        <w:rPr>
-          <w:i/>
-          <w:iCs/>
-        </w:rPr>
-        <w:t xml:space="preserve">Start</w:t>
-      </w:r>
-      <w:r>
-        <w:t xml:space="preserve">.</w:t>
+        <w:t xml:space="preserve">Netzname und Kennwort in die beiden Zeilen am Kopf von</w:t>
+      </w:r>
+      <w:r>
+        <w:t xml:space="preserve"> </w:t>
+      </w:r>
+      <w:r>
+        <w:rPr>
+          <w:rStyle w:val="VerbatimChar"/>
+        </w:rPr>
+        <w:t xml:space="preserve">RTTY_Wetter_20.py</w:t>
+      </w:r>
+      <w:r>
+        <w:t xml:space="preserve"> </w:t>
+      </w:r>
+      <w:r>
+        <w:t xml:space="preserve">eintragen. In der</w:t>
+      </w:r>
+      <w:r>
+        <w:t xml:space="preserve"> </w:t>
+      </w:r>
+      <w:r>
+        <w:t xml:space="preserve">veröffentlichten Fassung heißen sie</w:t>
+      </w:r>
+      <w:r>
+        <w:t xml:space="preserve"> </w:t>
+      </w:r>
+      <w:r>
+        <w:rPr>
+          <w:rStyle w:val="VerbatimChar"/>
+        </w:rPr>
+        <w:t xml:space="preserve">WLAN_NAME</w:t>
+      </w:r>
+      <w:r>
+        <w:t xml:space="preserve"> </w:t>
+      </w:r>
+      <w:r>
+        <w:t xml:space="preserve">und</w:t>
+      </w:r>
+      <w:r>
+        <w:t xml:space="preserve"> </w:t>
+      </w:r>
+      <w:r>
+        <w:rPr>
+          <w:rStyle w:val="VerbatimChar"/>
+        </w:rPr>
+        <w:t xml:space="preserve">WLAN_WORT</w:t>
+      </w:r>
+      <w:r>
+        <w:t xml:space="preserve"> </w:t>
+      </w:r>
+      <w:r>
+        <w:t xml:space="preserve">und tragen Platzhalter; das</w:t>
+      </w:r>
+      <w:r>
+        <w:t xml:space="preserve"> </w:t>
+      </w:r>
+      <w:r>
+        <w:t xml:space="preserve">Kennwort ist dort durch genauso viele</w:t>
+      </w:r>
+      <w:r>
+        <w:t xml:space="preserve"> </w:t>
+      </w:r>
+      <w:r>
+        <w:rPr>
+          <w:rStyle w:val="VerbatimChar"/>
+        </w:rPr>
+        <w:t xml:space="preserve">x</w:t>
+      </w:r>
+      <w:r>
+        <w:t xml:space="preserve"> </w:t>
+      </w:r>
+      <w:r>
+        <w:t xml:space="preserve">ersetzt, wie es Zeichen hat. (Im Arbeitsexemplar heißen</w:t>
+      </w:r>
+      <w:r>
+        <w:t xml:space="preserve"> </w:t>
+      </w:r>
+      <w:r>
+        <w:t xml:space="preserve">die beiden Namen anders; die Ausfuhr benennt sie um, damit kein Prüfmuster für Zugangsdaten</w:t>
+      </w:r>
+      <w:r>
+        <w:t xml:space="preserve"> </w:t>
+      </w:r>
+      <w:r>
+        <w:t xml:space="preserve">anschlägt.)</w:t>
       </w:r>
     </w:p>
     <w:p>
@@ -9893,16 +10118,31 @@
         </w:numPr>
       </w:pPr>
       <w:r>
-        <w:t xml:space="preserve">Emulator im Terminal:</w:t>
-      </w:r>
-      <w:r>
-        <w:t xml:space="preserve"> </w:t>
-      </w:r>
-      <w:r>
-        <w:rPr>
-          <w:rStyle w:val="VerbatimChar"/>
-        </w:rPr>
-        <w:t xml:space="preserve">python3 fernschreiber_emulator.py --selftest</w:t>
+        <w:t xml:space="preserve">Die Datei als</w:t>
+      </w:r>
+      <w:r>
+        <w:t xml:space="preserve"> </w:t>
+      </w:r>
+      <w:r>
+        <w:rPr>
+          <w:rStyle w:val="VerbatimChar"/>
+        </w:rPr>
+        <w:t xml:space="preserve">main.py</w:t>
+      </w:r>
+      <w:r>
+        <w:t xml:space="preserve"> </w:t>
+      </w:r>
+      <w:r>
+        <w:t xml:space="preserve">auf den ESP32 bringen, zusammen mit</w:t>
+      </w:r>
+      <w:r>
+        <w:t xml:space="preserve"> </w:t>
+      </w:r>
+      <w:r>
+        <w:rPr>
+          <w:rStyle w:val="VerbatimChar"/>
+        </w:rPr>
+        <w:t xml:space="preserve">ssd1306.py</w:t>
       </w:r>
       <w:r>
         <w:t xml:space="preserve">.</w:t>
@@ -9917,19 +10157,113 @@
         </w:numPr>
       </w:pPr>
       <w:r>
-        <w:t xml:space="preserve">Prüfprogramm:</w:t>
-      </w:r>
-      <w:r>
-        <w:t xml:space="preserve"> </w:t>
-      </w:r>
-      <w:r>
-        <w:rPr>
-          <w:rStyle w:val="VerbatimChar"/>
-        </w:rPr>
-        <w:t xml:space="preserve">python3 test_rtty.py</w:t>
-      </w:r>
-      <w:r>
-        <w:t xml:space="preserve">.</w:t>
+        <w:t xml:space="preserve">Nach dem Start zeigt das OLED den WLAN-Zustand und die Adresse, dann läuft die Station: erster</w:t>
+      </w:r>
+      <w:r>
+        <w:t xml:space="preserve"> </w:t>
+      </w:r>
+      <w:r>
+        <w:t xml:space="preserve">gültiger Datensatz → Komplettdruck; danach Druck bei Änderung; alle sechs Stunden ein</w:t>
+      </w:r>
+      <w:r>
+        <w:t xml:space="preserve"> </w:t>
+      </w:r>
+      <w:r>
+        <w:t xml:space="preserve">Komplettdruck.</w:t>
+      </w:r>
+    </w:p>
+    <w:p>
+      <w:pPr>
+        <w:pStyle w:val="FirstParagraph"/>
+      </w:pPr>
+      <w:r>
+        <w:rPr>
+          <w:b/>
+          <w:bCs/>
+        </w:rPr>
+        <w:t xml:space="preserve">Stellschrauben:</w:t>
+      </w:r>
+      <w:r>
+        <w:t xml:space="preserve"> </w:t>
+      </w:r>
+      <w:r>
+        <w:rPr>
+          <w:rStyle w:val="VerbatimChar"/>
+        </w:rPr>
+        <w:t xml:space="preserve">ABFRAGE_INTERVALL</w:t>
+      </w:r>
+      <w:r>
+        <w:t xml:space="preserve"> </w:t>
+      </w:r>
+      <w:r>
+        <w:t xml:space="preserve">(Abfragetakt),</w:t>
+      </w:r>
+      <w:r>
+        <w:t xml:space="preserve"> </w:t>
+      </w:r>
+      <w:r>
+        <w:rPr>
+          <w:rStyle w:val="VerbatimChar"/>
+        </w:rPr>
+        <w:t xml:space="preserve">IMMER_DRUCKEN</w:t>
+      </w:r>
+      <w:r>
+        <w:t xml:space="preserve"> </w:t>
+      </w:r>
+      <w:r>
+        <w:t xml:space="preserve">(immer oder nur bei</w:t>
+      </w:r>
+      <w:r>
+        <w:t xml:space="preserve"> </w:t>
+      </w:r>
+      <w:r>
+        <w:t xml:space="preserve">Änderung),</w:t>
+      </w:r>
+      <w:r>
+        <w:t xml:space="preserve"> </w:t>
+      </w:r>
+      <w:r>
+        <w:rPr>
+          <w:rStyle w:val="VerbatimChar"/>
+        </w:rPr>
+        <w:t xml:space="preserve">KOMPLETT_INTERVALL</w:t>
+      </w:r>
+      <w:r>
+        <w:t xml:space="preserve"> </w:t>
+      </w:r>
+      <w:r>
+        <w:t xml:space="preserve">(Rhythmus des Komplettdrucks),</w:t>
+      </w:r>
+      <w:r>
+        <w:t xml:space="preserve"> </w:t>
+      </w:r>
+      <w:r>
+        <w:rPr>
+          <w:rStyle w:val="VerbatimChar"/>
+        </w:rPr>
+        <w:t xml:space="preserve">T68D_LINE_LENGTH</w:t>
+      </w:r>
+      <w:r>
+        <w:t xml:space="preserve"> </w:t>
+      </w:r>
+      <w:r>
+        <w:t xml:space="preserve">(Streifenbreite in</w:t>
+      </w:r>
+      <w:r>
+        <w:t xml:space="preserve"> </w:t>
+      </w:r>
+      <w:r>
+        <w:t xml:space="preserve">Zeichen).</w:t>
+      </w:r>
+    </w:p>
+    <w:bookmarkEnd w:id="53"/>
+    <w:bookmarkStart w:id="54" w:name="auf-dem-pc"/>
+    <w:p>
+      <w:pPr>
+        <w:pStyle w:val="Heading2"/>
+      </w:pPr>
+      <w:r>
+        <w:t xml:space="preserve">Auf dem PC</w:t>
       </w:r>
     </w:p>
     <w:p>
@@ -9937,20 +10271,33 @@
         <w:pStyle w:val="Compact"/>
         <w:numPr>
           <w:ilvl w:val="0"/>
-          <w:numId w:val="1014"/>
+          <w:numId w:val="1015"/>
         </w:numPr>
       </w:pPr>
       <w:r>
-        <w:t xml:space="preserve">Seite bauen:</w:t>
-      </w:r>
-      <w:r>
-        <w:t xml:space="preserve"> </w:t>
-      </w:r>
-      <w:r>
-        <w:rPr>
-          <w:rStyle w:val="VerbatimChar"/>
-        </w:rPr>
-        <w:t xml:space="preserve">python3 seite/erstelle_fernschreiber_seite.py</w:t>
+        <w:t xml:space="preserve">Emulator mit Grafik:</w:t>
+      </w:r>
+      <w:r>
+        <w:t xml:space="preserve"> </w:t>
+      </w:r>
+      <w:r>
+        <w:rPr>
+          <w:rStyle w:val="VerbatimChar"/>
+        </w:rPr>
+        <w:t xml:space="preserve">python3 fernschreiber_emulator.py</w:t>
+      </w:r>
+      <w:r>
+        <w:t xml:space="preserve">, dann</w:t>
+      </w:r>
+      <w:r>
+        <w:t xml:space="preserve"> </w:t>
+      </w:r>
+      <w:r>
+        <w:rPr>
+          <w:i/>
+          <w:iCs/>
+        </w:rPr>
+        <w:t xml:space="preserve">Start</w:t>
       </w:r>
       <w:r>
         <w:t xml:space="preserve">.</w:t>
@@ -9961,10 +10308,82 @@
         <w:pStyle w:val="Compact"/>
         <w:numPr>
           <w:ilvl w:val="0"/>
-          <w:numId w:val="1014"/>
+          <w:numId w:val="1015"/>
         </w:numPr>
       </w:pPr>
       <w:r>
+        <w:t xml:space="preserve">Emulator im Terminal:</w:t>
+      </w:r>
+      <w:r>
+        <w:t xml:space="preserve"> </w:t>
+      </w:r>
+      <w:r>
+        <w:rPr>
+          <w:rStyle w:val="VerbatimChar"/>
+        </w:rPr>
+        <w:t xml:space="preserve">python3 fernschreiber_emulator.py --selftest</w:t>
+      </w:r>
+      <w:r>
+        <w:t xml:space="preserve">.</w:t>
+      </w:r>
+    </w:p>
+    <w:p>
+      <w:pPr>
+        <w:pStyle w:val="Compact"/>
+        <w:numPr>
+          <w:ilvl w:val="0"/>
+          <w:numId w:val="1015"/>
+        </w:numPr>
+      </w:pPr>
+      <w:r>
+        <w:t xml:space="preserve">Prüfprogramm:</w:t>
+      </w:r>
+      <w:r>
+        <w:t xml:space="preserve"> </w:t>
+      </w:r>
+      <w:r>
+        <w:rPr>
+          <w:rStyle w:val="VerbatimChar"/>
+        </w:rPr>
+        <w:t xml:space="preserve">python3 test_rtty.py</w:t>
+      </w:r>
+      <w:r>
+        <w:t xml:space="preserve">.</w:t>
+      </w:r>
+    </w:p>
+    <w:p>
+      <w:pPr>
+        <w:pStyle w:val="Compact"/>
+        <w:numPr>
+          <w:ilvl w:val="0"/>
+          <w:numId w:val="1015"/>
+        </w:numPr>
+      </w:pPr>
+      <w:r>
+        <w:t xml:space="preserve">Seite bauen:</w:t>
+      </w:r>
+      <w:r>
+        <w:t xml:space="preserve"> </w:t>
+      </w:r>
+      <w:r>
+        <w:rPr>
+          <w:rStyle w:val="VerbatimChar"/>
+        </w:rPr>
+        <w:t xml:space="preserve">python3 seite/erstelle_fernschreiber_seite.py</w:t>
+      </w:r>
+      <w:r>
+        <w:t xml:space="preserve">.</w:t>
+      </w:r>
+    </w:p>
+    <w:p>
+      <w:pPr>
+        <w:pStyle w:val="Compact"/>
+        <w:numPr>
+          <w:ilvl w:val="0"/>
+          <w:numId w:val="1015"/>
+        </w:numPr>
+      </w:pPr>
+      <w:r>
         <w:t xml:space="preserve">ITA2 nachrechnen:</w:t>
       </w:r>
       <w:r>
@@ -10009,9 +10428,9 @@
         <w:t xml:space="preserve">zusätzlich eine Netzverbindung, weil er echte Wetterdaten holt.</w:t>
       </w:r>
     </w:p>
-    <w:bookmarkEnd w:id="53"/>
     <w:bookmarkEnd w:id="54"/>
-    <w:bookmarkStart w:id="55" w:name="fehlersuche"/>
+    <w:bookmarkEnd w:id="55"/>
+    <w:bookmarkStart w:id="56" w:name="fehlersuche"/>
     <w:p>
       <w:pPr>
         <w:pStyle w:val="Heading1"/>
@@ -10330,8 +10749,8 @@
         </w:tc>
       </w:tr>
     </w:tbl>
-    <w:bookmarkEnd w:id="55"/>
-    <w:bookmarkStart w:id="56" w:name="entwicklungsgeschichte"/>
+    <w:bookmarkEnd w:id="56"/>
+    <w:bookmarkStart w:id="57" w:name="entwicklungsgeschichte"/>
     <w:p>
       <w:pPr>
         <w:pStyle w:val="Heading1"/>
@@ -10601,8 +11020,8 @@
         <w:t xml:space="preserve">.</w:t>
       </w:r>
     </w:p>
-    <w:bookmarkEnd w:id="56"/>
-    <w:bookmarkStart w:id="62" w:name="anhang"/>
+    <w:bookmarkEnd w:id="57"/>
+    <w:bookmarkStart w:id="63" w:name="anhang"/>
     <w:p>
       <w:pPr>
         <w:pStyle w:val="Heading1"/>
@@ -10611,7 +11030,7 @@
         <w:t xml:space="preserve">14. Anhang</w:t>
       </w:r>
     </w:p>
-    <w:bookmarkStart w:id="57" w:name="X288fb50d691fd4b9f4359a03889f00a1bb5c8cb"/>
+    <w:bookmarkStart w:id="58" w:name="X288fb50d691fd4b9f4359a03889f00a1bb5c8cb"/>
     <w:p>
       <w:pPr>
         <w:pStyle w:val="Heading2"/>
@@ -12198,8 +12617,8 @@
         <w:t xml:space="preserve">Die vier Steuercodes stehen in Kapitel 3.3.</w:t>
       </w:r>
     </w:p>
-    <w:bookmarkEnd w:id="57"/>
-    <w:bookmarkStart w:id="58" w:name="die-formatzeichen-von-wttr.in"/>
+    <w:bookmarkEnd w:id="58"/>
+    <w:bookmarkStart w:id="59" w:name="die-formatzeichen-von-wttr.in"/>
     <w:p>
       <w:pPr>
         <w:pStyle w:val="Heading2"/>
@@ -12576,8 +12995,8 @@
         </w:tc>
       </w:tr>
     </w:tbl>
-    <w:bookmarkEnd w:id="58"/>
-    <w:bookmarkStart w:id="59" w:name="die-formeln-auf-einen-blick"/>
+    <w:bookmarkEnd w:id="59"/>
+    <w:bookmarkStart w:id="60" w:name="die-formeln-auf-einen-blick"/>
     <w:p>
       <w:pPr>
         <w:pStyle w:val="Heading2"/>
@@ -12996,184 +13415,14 @@
         </m:oMath>
       </m:oMathPara>
     </w:p>
-    <w:bookmarkEnd w:id="59"/>
-    <w:bookmarkStart w:id="60" w:name="wörter"/>
+    <w:bookmarkEnd w:id="60"/>
+    <w:bookmarkStart w:id="61" w:name="wörter"/>
     <w:p>
       <w:pPr>
         <w:pStyle w:val="Heading2"/>
       </w:pPr>
       <w:r>
         <w:t xml:space="preserve">14.4 Wörter</w:t>
-      </w:r>
-    </w:p>
-    <w:p>
-      <w:pPr>
-        <w:pStyle w:val="Compact"/>
-        <w:numPr>
-          <w:ilvl w:val="0"/>
-          <w:numId w:val="1015"/>
-        </w:numPr>
-      </w:pPr>
-      <w:r>
-        <w:rPr>
-          <w:b/>
-          <w:bCs/>
-        </w:rPr>
-        <w:t xml:space="preserve">RTTY</w:t>
-      </w:r>
-      <w:r>
-        <w:t xml:space="preserve"> </w:t>
-      </w:r>
-      <w:r>
-        <w:t xml:space="preserve">— Funkfernschreiben; serielle Start-Stopp-Übertragung.</w:t>
-      </w:r>
-    </w:p>
-    <w:p>
-      <w:pPr>
-        <w:pStyle w:val="Compact"/>
-        <w:numPr>
-          <w:ilvl w:val="0"/>
-          <w:numId w:val="1015"/>
-        </w:numPr>
-      </w:pPr>
-      <w:r>
-        <w:rPr>
-          <w:b/>
-          <w:bCs/>
-        </w:rPr>
-        <w:t xml:space="preserve">ITA2 / Baudot-Murray</w:t>
-      </w:r>
-      <w:r>
-        <w:t xml:space="preserve"> </w:t>
-      </w:r>
-      <w:r>
-        <w:t xml:space="preserve">— der Fünf-Bit-Fernschreibcode mit den beiden Umschaltebenen.</w:t>
-      </w:r>
-    </w:p>
-    <w:p>
-      <w:pPr>
-        <w:pStyle w:val="Compact"/>
-        <w:numPr>
-          <w:ilvl w:val="0"/>
-          <w:numId w:val="1015"/>
-        </w:numPr>
-      </w:pPr>
-      <w:r>
-        <w:rPr>
-          <w:b/>
-          <w:bCs/>
-        </w:rPr>
-        <w:t xml:space="preserve">Mark / Space</w:t>
-      </w:r>
-      <w:r>
-        <w:t xml:space="preserve"> </w:t>
-      </w:r>
-      <w:r>
-        <w:t xml:space="preserve">— logisch 1 (Ruhe) und logisch 0 auf der Leitung.</w:t>
-      </w:r>
-    </w:p>
-    <w:p>
-      <w:pPr>
-        <w:pStyle w:val="Compact"/>
-        <w:numPr>
-          <w:ilvl w:val="0"/>
-          <w:numId w:val="1015"/>
-        </w:numPr>
-      </w:pPr>
-      <w:r>
-        <w:rPr>
-          <w:b/>
-          <w:bCs/>
-        </w:rPr>
-        <w:t xml:space="preserve">LTRS / FIGS</w:t>
-      </w:r>
-      <w:r>
-        <w:t xml:space="preserve"> </w:t>
-      </w:r>
-      <w:r>
-        <w:t xml:space="preserve">— Buchstaben- und Ziffernebene.</w:t>
-      </w:r>
-    </w:p>
-    <w:p>
-      <w:pPr>
-        <w:pStyle w:val="Compact"/>
-        <w:numPr>
-          <w:ilvl w:val="0"/>
-          <w:numId w:val="1015"/>
-        </w:numPr>
-      </w:pPr>
-      <w:r>
-        <w:rPr>
-          <w:b/>
-          <w:bCs/>
-        </w:rPr>
-        <w:t xml:space="preserve">Baud</w:t>
-      </w:r>
-      <w:r>
-        <w:t xml:space="preserve"> </w:t>
-      </w:r>
-      <w:r>
-        <w:t xml:space="preserve">— Schritte je Sekunde; hier 50, also 20 ms je Schritt.</w:t>
-      </w:r>
-    </w:p>
-    <w:p>
-      <w:pPr>
-        <w:pStyle w:val="Compact"/>
-        <w:numPr>
-          <w:ilvl w:val="0"/>
-          <w:numId w:val="1015"/>
-        </w:numPr>
-      </w:pPr>
-      <w:r>
-        <w:rPr>
-          <w:b/>
-          <w:bCs/>
-        </w:rPr>
-        <w:t xml:space="preserve">Streifenschreiber</w:t>
-      </w:r>
-      <w:r>
-        <w:t xml:space="preserve"> </w:t>
-      </w:r>
-      <w:r>
-        <w:t xml:space="preserve">— eine Fernschreibmaschine, die fortlaufend auf einen schmalen Papierstreifen</w:t>
-      </w:r>
-      <w:r>
-        <w:t xml:space="preserve"> </w:t>
-      </w:r>
-      <w:r>
-        <w:t xml:space="preserve">druckt, im Gegensatz zum Blattschreiber.</w:t>
-      </w:r>
-    </w:p>
-    <w:p>
-      <w:pPr>
-        <w:pStyle w:val="Compact"/>
-        <w:numPr>
-          <w:ilvl w:val="0"/>
-          <w:numId w:val="1015"/>
-        </w:numPr>
-      </w:pPr>
-      <w:r>
-        <w:rPr>
-          <w:b/>
-          <w:bCs/>
-        </w:rPr>
-        <w:t xml:space="preserve">Attrappe (Stub)</w:t>
-      </w:r>
-      <w:r>
-        <w:t xml:space="preserve"> </w:t>
-      </w:r>
-      <w:r>
-        <w:t xml:space="preserve">— ein nachgebildetes Modul, das im Emulator die echte Hardware ersetzt.</w:t>
-      </w:r>
-    </w:p>
-    <w:bookmarkEnd w:id="60"/>
-    <w:bookmarkStart w:id="61" w:name="quellen-und-offene-punkte"/>
-    <w:p>
-      <w:pPr>
-        <w:pStyle w:val="Heading2"/>
-      </w:pPr>
-      <w:r>
-        <w:t xml:space="preserve">14.5 Quellen und offene Punkte</w:t>
       </w:r>
     </w:p>
     <w:p>
@@ -13185,26 +13434,17 @@
         </w:numPr>
       </w:pPr>
       <w:r>
-        <w:t xml:space="preserve">Siemens,</w:t>
-      </w:r>
-      <w:r>
-        <w:t xml:space="preserve"> </w:t>
-      </w:r>
-      <w:r>
-        <w:rPr>
-          <w:i/>
-          <w:iCs/>
-        </w:rPr>
-        <w:t xml:space="preserve">Fernschreibmaschine T68 — Beschreibung</w:t>
-      </w:r>
-      <w:r>
-        <w:t xml:space="preserve">, Dezember 1959 (Betriebsanleitung des</w:t>
-      </w:r>
-      <w:r>
-        <w:t xml:space="preserve"> </w:t>
-      </w:r>
-      <w:r>
-        <w:t xml:space="preserve">Herstellers; wegen fremden Urheberrechts nicht mitveröffentlicht).</w:t>
+        <w:rPr>
+          <w:b/>
+          <w:bCs/>
+        </w:rPr>
+        <w:t xml:space="preserve">RTTY</w:t>
+      </w:r>
+      <w:r>
+        <w:t xml:space="preserve"> </w:t>
+      </w:r>
+      <w:r>
+        <w:t xml:space="preserve">— Funkfernschreiben; serielle Start-Stopp-Übertragung.</w:t>
       </w:r>
     </w:p>
     <w:p>
@@ -13216,7 +13456,17 @@
         </w:numPr>
       </w:pPr>
       <w:r>
-        <w:t xml:space="preserve">wttr.in, Formatzeichen der Textschnittstelle.</w:t>
+        <w:rPr>
+          <w:b/>
+          <w:bCs/>
+        </w:rPr>
+        <w:t xml:space="preserve">ITA2 / Baudot-Murray</w:t>
+      </w:r>
+      <w:r>
+        <w:t xml:space="preserve"> </w:t>
+      </w:r>
+      <w:r>
+        <w:t xml:space="preserve">— der Fünf-Bit-Fernschreibcode mit den beiden Umschaltebenen.</w:t>
       </w:r>
     </w:p>
     <w:p>
@@ -13228,49 +13478,121 @@
         </w:numPr>
       </w:pPr>
       <w:r>
-        <w:t xml:space="preserve">Die Zahlenwerte dieses Manuskripts sind aus</w:t>
-      </w:r>
-      <w:r>
-        <w:t xml:space="preserve"> </w:t>
-      </w:r>
-      <w:r>
-        <w:rPr>
-          <w:rStyle w:val="VerbatimChar"/>
-        </w:rPr>
-        <w:t xml:space="preserve">RTTY_Wetter_20.py</w:t>
-      </w:r>
-      <w:r>
-        <w:t xml:space="preserve"> </w:t>
-      </w:r>
-      <w:r>
-        <w:t xml:space="preserve">gerechnet</w:t>
-      </w:r>
-      <w:r>
-        <w:t xml:space="preserve"> </w:t>
-      </w:r>
-      <w:r>
-        <w:t xml:space="preserve">(</w:t>
-      </w:r>
-      <w:r>
-        <w:rPr>
-          <w:rStyle w:val="VerbatimChar"/>
-        </w:rPr>
-        <w:t xml:space="preserve">seite/nachrechnung_ita2.py</w:t>
-      </w:r>
-      <w:r>
-        <w:t xml:space="preserve">), die Aussagen zum Druckbild aus dem Foto und dem Video abgelesen.</w:t>
-      </w:r>
-    </w:p>
-    <w:p>
-      <w:pPr>
-        <w:pStyle w:val="FirstParagraph"/>
-      </w:pPr>
-      <w:r>
         <w:rPr>
           <w:b/>
           <w:bCs/>
         </w:rPr>
-        <w:t xml:space="preserve">Offen:</w:t>
+        <w:t xml:space="preserve">Mark / Space</w:t>
+      </w:r>
+      <w:r>
+        <w:t xml:space="preserve"> </w:t>
+      </w:r>
+      <w:r>
+        <w:t xml:space="preserve">— logisch 1 (Ruhe) und logisch 0 auf der Leitung.</w:t>
+      </w:r>
+    </w:p>
+    <w:p>
+      <w:pPr>
+        <w:pStyle w:val="Compact"/>
+        <w:numPr>
+          <w:ilvl w:val="0"/>
+          <w:numId w:val="1016"/>
+        </w:numPr>
+      </w:pPr>
+      <w:r>
+        <w:rPr>
+          <w:b/>
+          <w:bCs/>
+        </w:rPr>
+        <w:t xml:space="preserve">LTRS / FIGS</w:t>
+      </w:r>
+      <w:r>
+        <w:t xml:space="preserve"> </w:t>
+      </w:r>
+      <w:r>
+        <w:t xml:space="preserve">— Buchstaben- und Ziffernebene.</w:t>
+      </w:r>
+    </w:p>
+    <w:p>
+      <w:pPr>
+        <w:pStyle w:val="Compact"/>
+        <w:numPr>
+          <w:ilvl w:val="0"/>
+          <w:numId w:val="1016"/>
+        </w:numPr>
+      </w:pPr>
+      <w:r>
+        <w:rPr>
+          <w:b/>
+          <w:bCs/>
+        </w:rPr>
+        <w:t xml:space="preserve">Baud</w:t>
+      </w:r>
+      <w:r>
+        <w:t xml:space="preserve"> </w:t>
+      </w:r>
+      <w:r>
+        <w:t xml:space="preserve">— Schritte je Sekunde; hier 50, also 20 ms je Schritt.</w:t>
+      </w:r>
+    </w:p>
+    <w:p>
+      <w:pPr>
+        <w:pStyle w:val="Compact"/>
+        <w:numPr>
+          <w:ilvl w:val="0"/>
+          <w:numId w:val="1016"/>
+        </w:numPr>
+      </w:pPr>
+      <w:r>
+        <w:rPr>
+          <w:b/>
+          <w:bCs/>
+        </w:rPr>
+        <w:t xml:space="preserve">Streifenschreiber</w:t>
+      </w:r>
+      <w:r>
+        <w:t xml:space="preserve"> </w:t>
+      </w:r>
+      <w:r>
+        <w:t xml:space="preserve">— eine Fernschreibmaschine, die fortlaufend auf einen schmalen Papierstreifen</w:t>
+      </w:r>
+      <w:r>
+        <w:t xml:space="preserve"> </w:t>
+      </w:r>
+      <w:r>
+        <w:t xml:space="preserve">druckt, im Gegensatz zum Blattschreiber.</w:t>
+      </w:r>
+    </w:p>
+    <w:p>
+      <w:pPr>
+        <w:pStyle w:val="Compact"/>
+        <w:numPr>
+          <w:ilvl w:val="0"/>
+          <w:numId w:val="1016"/>
+        </w:numPr>
+      </w:pPr>
+      <w:r>
+        <w:rPr>
+          <w:b/>
+          <w:bCs/>
+        </w:rPr>
+        <w:t xml:space="preserve">Attrappe (Stub)</w:t>
+      </w:r>
+      <w:r>
+        <w:t xml:space="preserve"> </w:t>
+      </w:r>
+      <w:r>
+        <w:t xml:space="preserve">— ein nachgebildetes Modul, das im Emulator die echte Hardware ersetzt.</w:t>
+      </w:r>
+    </w:p>
+    <w:bookmarkEnd w:id="61"/>
+    <w:bookmarkStart w:id="62" w:name="quellen-und-offene-punkte"/>
+    <w:p>
+      <w:pPr>
+        <w:pStyle w:val="Heading2"/>
+      </w:pPr>
+      <w:r>
+        <w:t xml:space="preserve">14.5 Quellen und offene Punkte</w:t>
       </w:r>
     </w:p>
     <w:p>
@@ -13282,13 +13604,26 @@
         </w:numPr>
       </w:pPr>
       <w:r>
-        <w:t xml:space="preserve">Die Spurzuordnung der Lochung am Gerät ist nicht nachgemessen; die Simulation zeichnet sie nach</w:t>
-      </w:r>
-      <w:r>
-        <w:t xml:space="preserve"> </w:t>
-      </w:r>
-      <w:r>
-        <w:t xml:space="preserve">der Fünf-Spur-Norm und sagt das dort.</w:t>
+        <w:t xml:space="preserve">Siemens,</w:t>
+      </w:r>
+      <w:r>
+        <w:t xml:space="preserve"> </w:t>
+      </w:r>
+      <w:r>
+        <w:rPr>
+          <w:i/>
+          <w:iCs/>
+        </w:rPr>
+        <w:t xml:space="preserve">Fernschreibmaschine T68 — Beschreibung</w:t>
+      </w:r>
+      <w:r>
+        <w:t xml:space="preserve">, Dezember 1959 (Betriebsanleitung des</w:t>
+      </w:r>
+      <w:r>
+        <w:t xml:space="preserve"> </w:t>
+      </w:r>
+      <w:r>
+        <w:t xml:space="preserve">Herstellers; wegen fremden Urheberrechts nicht mitveröffentlicht).</w:t>
       </w:r>
     </w:p>
     <w:p>
@@ -13300,6 +13635,90 @@
         </w:numPr>
       </w:pPr>
       <w:r>
+        <w:t xml:space="preserve">wttr.in, Formatzeichen der Textschnittstelle.</w:t>
+      </w:r>
+    </w:p>
+    <w:p>
+      <w:pPr>
+        <w:pStyle w:val="Compact"/>
+        <w:numPr>
+          <w:ilvl w:val="0"/>
+          <w:numId w:val="1017"/>
+        </w:numPr>
+      </w:pPr>
+      <w:r>
+        <w:t xml:space="preserve">Die Zahlenwerte dieses Manuskripts sind aus</w:t>
+      </w:r>
+      <w:r>
+        <w:t xml:space="preserve"> </w:t>
+      </w:r>
+      <w:r>
+        <w:rPr>
+          <w:rStyle w:val="VerbatimChar"/>
+        </w:rPr>
+        <w:t xml:space="preserve">RTTY_Wetter_20.py</w:t>
+      </w:r>
+      <w:r>
+        <w:t xml:space="preserve"> </w:t>
+      </w:r>
+      <w:r>
+        <w:t xml:space="preserve">gerechnet</w:t>
+      </w:r>
+      <w:r>
+        <w:t xml:space="preserve"> </w:t>
+      </w:r>
+      <w:r>
+        <w:t xml:space="preserve">(</w:t>
+      </w:r>
+      <w:r>
+        <w:rPr>
+          <w:rStyle w:val="VerbatimChar"/>
+        </w:rPr>
+        <w:t xml:space="preserve">seite/nachrechnung_ita2.py</w:t>
+      </w:r>
+      <w:r>
+        <w:t xml:space="preserve">), die Aussagen zum Druckbild aus dem Foto und dem Video abgelesen.</w:t>
+      </w:r>
+    </w:p>
+    <w:p>
+      <w:pPr>
+        <w:pStyle w:val="FirstParagraph"/>
+      </w:pPr>
+      <w:r>
+        <w:rPr>
+          <w:b/>
+          <w:bCs/>
+        </w:rPr>
+        <w:t xml:space="preserve">Offen:</w:t>
+      </w:r>
+    </w:p>
+    <w:p>
+      <w:pPr>
+        <w:pStyle w:val="Compact"/>
+        <w:numPr>
+          <w:ilvl w:val="0"/>
+          <w:numId w:val="1018"/>
+        </w:numPr>
+      </w:pPr>
+      <w:r>
+        <w:t xml:space="preserve">Die Spurzuordnung der Lochung am Gerät ist nicht nachgemessen; die Simulation zeichnet sie nach</w:t>
+      </w:r>
+      <w:r>
+        <w:t xml:space="preserve"> </w:t>
+      </w:r>
+      <w:r>
+        <w:t xml:space="preserve">der Fünf-Spur-Norm und sagt das dort.</w:t>
+      </w:r>
+    </w:p>
+    <w:p>
+      <w:pPr>
+        <w:pStyle w:val="Compact"/>
+        <w:numPr>
+          <w:ilvl w:val="0"/>
+          <w:numId w:val="1018"/>
+        </w:numPr>
+      </w:pPr>
+      <w:r>
         <w:t xml:space="preserve">Ob die Maschine die Umschaltzeichen LTRS und FIGS wirklich ohne Vorschub verarbeitet, ist aus dem</w:t>
       </w:r>
       <w:r>
@@ -13466,8 +13885,8 @@
         <w:t xml:space="preserve">.</w:t>
       </w:r>
     </w:p>
-    <w:bookmarkEnd w:id="61"/>
     <w:bookmarkEnd w:id="62"/>
+    <w:bookmarkEnd w:id="63"/>
     <w:sectPr/>
   </w:body>
 </w:document>
@@ -13883,6 +14302,9 @@
     <w:abstractNumId w:val="991"/>
   </w:num>
   <w:num w:numId="1013">
+    <w:abstractNumId w:val="991"/>
+  </w:num>
+  <w:num w:numId="1014">
     <w:abstractNumId w:val="99411"/>
     <w:lvlOverride w:ilvl="0">
       <w:startOverride w:val="1"/>
@@ -13912,9 +14334,6 @@
       <w:startOverride w:val="1"/>
     </w:lvlOverride>
   </w:num>
-  <w:num w:numId="1014">
-    <w:abstractNumId w:val="991"/>
-  </w:num>
   <w:num w:numId="1015">
     <w:abstractNumId w:val="991"/>
   </w:num>
@@ -13922,6 +14341,9 @@
     <w:abstractNumId w:val="991"/>
   </w:num>
   <w:num w:numId="1017">
+    <w:abstractNumId w:val="991"/>
+  </w:num>
+  <w:num w:numId="1018">
     <w:abstractNumId w:val="991"/>
   </w:num>
 </w:numbering>

</xml_diff>